<commit_message>
Résumé: add Ziqpu as lead project + school GitHub in header
Ziqpu (multi-agent astrology synastry engine, team lead) leads
Technical Projects; header now lists both nessaisling-lab and
aislingld-pursuit. Rebuilt all 7 formats, one page.

Co-Authored-By: Claude Opus 4.8 (1M context) <noreply@anthropic.com>
</commit_message>
<xml_diff>
--- a/assets/docs/resume/resume.docx
+++ b/assets/docs/resume/resume.docx
@@ -2,7 +2,7 @@
 <file path=word/document.xml><?xml version="1.0" encoding="utf-8"?>
 <w:document xmlns:w="http://schemas.openxmlformats.org/wordprocessingml/2006/main" xmlns:m="http://schemas.openxmlformats.org/officeDocument/2006/math" xmlns:r="http://schemas.openxmlformats.org/officeDocument/2006/relationships" xmlns:o="urn:schemas-microsoft-com:office:office" xmlns:v="urn:schemas-microsoft-com:vml" xmlns:w10="urn:schemas-microsoft-com:office:word" xmlns:a="http://schemas.openxmlformats.org/drawingml/2006/main" xmlns:pic="http://schemas.openxmlformats.org/drawingml/2006/picture" xmlns:wp="http://schemas.openxmlformats.org/drawingml/2006/wordprocessingDrawing">
   <w:body>
-    <w:bookmarkStart w:id="18" w:name="stan-aisling-leiva-davila"/>
+    <w:bookmarkStart w:id="20" w:name="stan-aisling-leiva-davila"/>
     <w:p>
       <w:pPr>
         <w:pStyle w:val="Heading1"/>
@@ -54,8 +54,25 @@
           <w:t xml:space="preserve">github.com/nessaisling-lab</w:t>
         </w:r>
       </w:hyperlink>
-    </w:p>
-    <w:bookmarkStart w:id="11" w:name="professional-summary"/>
+      <w:r>
+        <w:t xml:space="preserve"> </w:t>
+      </w:r>
+      <w:r>
+        <w:t xml:space="preserve">·</w:t>
+      </w:r>
+      <w:r>
+        <w:t xml:space="preserve"> </w:t>
+      </w:r>
+      <w:hyperlink r:id="rId11">
+        <w:r>
+          <w:rPr>
+            <w:rStyle w:val="Hyperlink"/>
+          </w:rPr>
+          <w:t xml:space="preserve">github.com/aislingld-pursuit</w:t>
+        </w:r>
+      </w:hyperlink>
+    </w:p>
+    <w:bookmarkStart w:id="12" w:name="professional-summary"/>
     <w:p>
       <w:pPr>
         <w:pStyle w:val="Heading2"/>
@@ -72,8 +89,8 @@
         <w:t xml:space="preserve">Self-taught AI Builder and founder who ships production-grade systems solo and on small teams. Built a native-Rust financial-intelligence terminal (+37% paper-trade ROI) and a privacy-first, on-device voice-to-text app — both cross-platform desktop products. Hardware-fluent (Aircraft A&amp;P coursework, CompTIA A+) with end-to-end ownership from systems and data pipelines through UI and go-to-market. Inaugural cohort of Pursuit’s AI-Native Builder program.</w:t>
       </w:r>
     </w:p>
-    <w:bookmarkEnd w:id="11"/>
-    <w:bookmarkStart w:id="12" w:name="experience"/>
+    <w:bookmarkEnd w:id="12"/>
+    <w:bookmarkStart w:id="13" w:name="experience"/>
     <w:p>
       <w:pPr>
         <w:pStyle w:val="Heading2"/>
@@ -214,8 +231,8 @@
         <w:t xml:space="preserve">Owned listing, marketing, bookkeeping, vendor coordination, and guest relations end-to-end — the same full-ownership discipline applied to software systems today.</w:t>
       </w:r>
     </w:p>
-    <w:bookmarkEnd w:id="12"/>
-    <w:bookmarkStart w:id="15" w:name="technical-projects"/>
+    <w:bookmarkEnd w:id="13"/>
+    <w:bookmarkStart w:id="17" w:name="technical-projects"/>
     <w:p>
       <w:pPr>
         <w:pStyle w:val="Heading2"/>
@@ -233,76 +250,13 @@
           <w:b/>
           <w:bCs/>
         </w:rPr>
-        <w:t xml:space="preserve">Resona / Wisper — Privacy-First On-Device Voice-to-Text</w:t>
+        <w:t xml:space="preserve">Ziqpu — Multi-Agent Astrology Synastry Engine</w:t>
       </w:r>
       <w:r>
         <w:t xml:space="preserve"> </w:t>
       </w:r>
       <w:r>
         <w:t xml:space="preserve">· 2026 ·</w:t>
-      </w:r>
-      <w:r>
-        <w:t xml:space="preserve"> </w:t>
-      </w:r>
-      <w:hyperlink r:id="rId13">
-        <w:r>
-          <w:rPr>
-            <w:rStyle w:val="Hyperlink"/>
-          </w:rPr>
-          <w:t xml:space="preserve">repo</w:t>
-        </w:r>
-      </w:hyperlink>
-      <w:r>
-        <w:t xml:space="preserve"> </w:t>
-      </w:r>
-      <w:r>
-        <w:rPr>
-          <w:i/>
-          <w:iCs/>
-        </w:rPr>
-        <w:t xml:space="preserve">Cross-platform desktop dictation app: live streaming + file/YouTube transcription, 100% on-device via whisper.cpp.</w:t>
-      </w:r>
-    </w:p>
-    <w:p>
-      <w:pPr>
-        <w:pStyle w:val="Compact"/>
-        <w:numPr>
-          <w:ilvl w:val="0"/>
-          <w:numId w:val="1004"/>
-        </w:numPr>
-      </w:pPr>
-      <w:r>
-        <w:t xml:space="preserve">Built a real-time pipeline (mic → cpal → energy-VAD → incremental Whisper) plus file and YouTube import with zero cloud STT and no accounts; four selectable GPU backends (CUDA / Vulkan / Metal / CPU) from one Tauri 2 + Rust + React codebase.</w:t>
-      </w:r>
-    </w:p>
-    <w:p>
-      <w:pPr>
-        <w:pStyle w:val="Compact"/>
-        <w:numPr>
-          <w:ilvl w:val="0"/>
-          <w:numId w:val="1004"/>
-        </w:numPr>
-      </w:pPr>
-      <w:r>
-        <w:t xml:space="preserve">Designed an Ed25519-signed-license freemium model with correct client-vs-server entitlement gating; hardened SSRF and unsafe-export issues (SEC-001/002); co-developed on a PRD + HEART process and shipped v0.2.0-beta.18 across Windows, macOS, and Linux.</w:t>
-      </w:r>
-    </w:p>
-    <w:p>
-      <w:pPr>
-        <w:pStyle w:val="FirstParagraph"/>
-      </w:pPr>
-      <w:r>
-        <w:rPr>
-          <w:b/>
-          <w:bCs/>
-        </w:rPr>
-        <w:t xml:space="preserve">Berkshire Hathaway, Reimagined — UX/UI Redesign</w:t>
-      </w:r>
-      <w:r>
-        <w:t xml:space="preserve"> </w:t>
-      </w:r>
-      <w:r>
-        <w:t xml:space="preserve">· 2025 ·</w:t>
       </w:r>
       <w:r>
         <w:t xml:space="preserve"> </w:t>
@@ -323,7 +277,58 @@
           <w:i/>
           <w:iCs/>
         </w:rPr>
-        <w:t xml:space="preserve">Conceptual redesign of berkshirehathaway.com synthesizing Apple’s HIG with Buffett’s 1996 Owner’s Manual.</w:t>
+        <w:t xml:space="preserve">Scores a natal chart against the chart of anything with a date of origin (v1: stocks by IPO); reflection, not advice.</w:t>
+      </w:r>
+    </w:p>
+    <w:p>
+      <w:pPr>
+        <w:pStyle w:val="Compact"/>
+        <w:numPr>
+          <w:ilvl w:val="0"/>
+          <w:numId w:val="1004"/>
+        </w:numPr>
+      </w:pPr>
+      <w:r>
+        <w:t xml:space="preserve">Led a 3-person team building a Rust workspace with two visible agents — a measurer that computes exact aspects from JPL-validated ephemeris and an interpreter that reads them back — plus a read-only axum sidecar, an MCP server, and a Dioxus desktop UI.</w:t>
+      </w:r>
+    </w:p>
+    <w:p>
+      <w:pPr>
+        <w:pStyle w:val="FirstParagraph"/>
+      </w:pPr>
+      <w:r>
+        <w:rPr>
+          <w:b/>
+          <w:bCs/>
+        </w:rPr>
+        <w:t xml:space="preserve">Resona / Wisper — Privacy-First On-Device Voice-to-Text</w:t>
+      </w:r>
+      <w:r>
+        <w:t xml:space="preserve"> </w:t>
+      </w:r>
+      <w:r>
+        <w:t xml:space="preserve">· 2026 ·</w:t>
+      </w:r>
+      <w:r>
+        <w:t xml:space="preserve"> </w:t>
+      </w:r>
+      <w:hyperlink r:id="rId15">
+        <w:r>
+          <w:rPr>
+            <w:rStyle w:val="Hyperlink"/>
+          </w:rPr>
+          <w:t xml:space="preserve">repo</w:t>
+        </w:r>
+      </w:hyperlink>
+      <w:r>
+        <w:t xml:space="preserve"> </w:t>
+      </w:r>
+      <w:r>
+        <w:rPr>
+          <w:i/>
+          <w:iCs/>
+        </w:rPr>
+        <w:t xml:space="preserve">Cross-platform desktop dictation app: live streaming + file/YouTube transcription, 100% on-device via whisper.cpp.</w:t>
       </w:r>
     </w:p>
     <w:p>
@@ -335,11 +340,74 @@
         </w:numPr>
       </w:pPr>
       <w:r>
+        <w:t xml:space="preserve">Built a real-time pipeline (mic → cpal → energy-VAD → incremental Whisper) plus file and YouTube import with zero cloud STT and no accounts; four selectable GPU backends (CUDA / Vulkan / Metal / CPU) from one Tauri 2 + Rust + React codebase.</w:t>
+      </w:r>
+    </w:p>
+    <w:p>
+      <w:pPr>
+        <w:pStyle w:val="Compact"/>
+        <w:numPr>
+          <w:ilvl w:val="0"/>
+          <w:numId w:val="1005"/>
+        </w:numPr>
+      </w:pPr>
+      <w:r>
+        <w:t xml:space="preserve">Designed an Ed25519-signed-license freemium model with correct client-vs-server entitlement gating; hardened SSRF and unsafe-export issues (SEC-001/002); co-developed on a PRD + HEART process and shipped v0.2.0-beta.18 across Windows, macOS, and Linux.</w:t>
+      </w:r>
+    </w:p>
+    <w:p>
+      <w:pPr>
+        <w:pStyle w:val="FirstParagraph"/>
+      </w:pPr>
+      <w:r>
+        <w:rPr>
+          <w:b/>
+          <w:bCs/>
+        </w:rPr>
+        <w:t xml:space="preserve">Berkshire Hathaway, Reimagined — UX/UI Redesign</w:t>
+      </w:r>
+      <w:r>
+        <w:t xml:space="preserve"> </w:t>
+      </w:r>
+      <w:r>
+        <w:t xml:space="preserve">· 2025 ·</w:t>
+      </w:r>
+      <w:r>
+        <w:t xml:space="preserve"> </w:t>
+      </w:r>
+      <w:hyperlink r:id="rId16">
+        <w:r>
+          <w:rPr>
+            <w:rStyle w:val="Hyperlink"/>
+          </w:rPr>
+          <w:t xml:space="preserve">repo</w:t>
+        </w:r>
+      </w:hyperlink>
+      <w:r>
+        <w:t xml:space="preserve"> </w:t>
+      </w:r>
+      <w:r>
+        <w:rPr>
+          <w:i/>
+          <w:iCs/>
+        </w:rPr>
+        <w:t xml:space="preserve">Conceptual redesign of berkshirehathaway.com synthesizing Apple’s HIG with Buffett’s 1996 Owner’s Manual.</w:t>
+      </w:r>
+    </w:p>
+    <w:p>
+      <w:pPr>
+        <w:pStyle w:val="Compact"/>
+        <w:numPr>
+          <w:ilvl w:val="0"/>
+          <w:numId w:val="1006"/>
+        </w:numPr>
+      </w:pPr>
+      <w:r>
         <w:t xml:space="preserve">Built a single-file HTML mockup and Figma spec organized around seven paired design principles, meeting WCAG 2.2 AA accessibility with an 8-section written design rationale.</w:t>
       </w:r>
     </w:p>
-    <w:bookmarkEnd w:id="15"/>
-    <w:bookmarkStart w:id="16" w:name="education"/>
+    <w:bookmarkEnd w:id="17"/>
+    <w:bookmarkStart w:id="18" w:name="education"/>
     <w:p>
       <w:pPr>
         <w:pStyle w:val="Heading2"/>
@@ -381,7 +449,7 @@
         <w:pStyle w:val="Compact"/>
         <w:numPr>
           <w:ilvl w:val="0"/>
-          <w:numId w:val="1006"/>
+          <w:numId w:val="1007"/>
         </w:numPr>
       </w:pPr>
       <w:r>
@@ -424,8 +492,8 @@
         <w:t xml:space="preserve">· Coursework complete · Flushing, NY</w:t>
       </w:r>
     </w:p>
-    <w:bookmarkEnd w:id="16"/>
-    <w:bookmarkStart w:id="17" w:name="skills-tools"/>
+    <w:bookmarkEnd w:id="18"/>
+    <w:bookmarkStart w:id="19" w:name="skills-tools"/>
     <w:p>
       <w:pPr>
         <w:pStyle w:val="Heading2"/>
@@ -439,7 +507,7 @@
         <w:pStyle w:val="Compact"/>
         <w:numPr>
           <w:ilvl w:val="0"/>
-          <w:numId w:val="1007"/>
+          <w:numId w:val="1008"/>
         </w:numPr>
       </w:pPr>
       <w:r>
@@ -461,7 +529,7 @@
         <w:pStyle w:val="Compact"/>
         <w:numPr>
           <w:ilvl w:val="0"/>
-          <w:numId w:val="1007"/>
+          <w:numId w:val="1008"/>
         </w:numPr>
       </w:pPr>
       <w:r>
@@ -483,7 +551,7 @@
         <w:pStyle w:val="Compact"/>
         <w:numPr>
           <w:ilvl w:val="0"/>
-          <w:numId w:val="1007"/>
+          <w:numId w:val="1008"/>
         </w:numPr>
       </w:pPr>
       <w:r>
@@ -500,8 +568,8 @@
         <w:t xml:space="preserve">Linux, Windows, Git/GitHub, GPU backends (CUDA/Vulkan/Metal), Linux device drivers, hardware bring-up, CompTIA A+, LAN/WLAN networking</w:t>
       </w:r>
     </w:p>
-    <w:bookmarkEnd w:id="17"/>
-    <w:bookmarkEnd w:id="18"/>
+    <w:bookmarkEnd w:id="19"/>
+    <w:bookmarkEnd w:id="20"/>
     <w:sectPr>
       <w:footnotePr>
         <w:numRestart w:val="eachSect"/>
@@ -737,6 +805,9 @@
     <w:abstractNumId w:val="991"/>
   </w:num>
   <w:num w:numId="1007">
+    <w:abstractNumId w:val="991"/>
+  </w:num>
+  <w:num w:numId="1008">
     <w:abstractNumId w:val="991"/>
   </w:num>
 </w:numbering>

</xml_diff>